<commit_message>
Arreglo en docuento 5
</commit_message>
<xml_diff>
--- a/Evidencias Grupales/1.5_GuiaEstudiante_Fase 1_Definicion Proyecto APT(Español).docx
+++ b/Evidencias Grupales/1.5_GuiaEstudiante_Fase 1_Definicion Proyecto APT(Español).docx
@@ -777,7 +777,7 @@
     <w:sdt>
       <w:sdtPr>
         <w:lock w:val="contentLocked"/>
-        <w:id w:val="-1028347588"/>
+        <w:id w:val="1327061767"/>
         <w:tag w:val="goog_rdk_0"/>
       </w:sdtPr>
       <w:sdtContent>
@@ -1038,7 +1038,7 @@
     <w:sdt>
       <w:sdtPr>
         <w:lock w:val="contentLocked"/>
-        <w:id w:val="-525585625"/>
+        <w:id w:val="-871410849"/>
         <w:tag w:val="goog_rdk_1"/>
       </w:sdtPr>
       <w:sdtContent>
@@ -2685,7 +2685,7 @@
                 <w:szCs w:val="20"/>
                 <w:rtl w:val="0"/>
               </w:rPr>
-              <w:t xml:space="preserve">Se levantara y definirán los requerimientos técnicos </w:t>
+              <w:t xml:space="preserve">Levantar y definir los requerimientos técnicos </w:t>
             </w:r>
           </w:p>
           <w:p>
@@ -2709,7 +2709,7 @@
                 <w:szCs w:val="20"/>
                 <w:rtl w:val="0"/>
               </w:rPr>
-              <w:t xml:space="preserve">Se diseñará la arquitectura conceptual, lógica y el pipeline de la ingesta de datos, logrando el 100% de la estructura planteada </w:t>
+              <w:t xml:space="preserve">Diseñar la arquitectura conceptual, lógica y el pipeline de la ingesta de datos, logrando el 100% de la estructura planteada </w:t>
             </w:r>
           </w:p>
           <w:p>
@@ -2733,7 +2733,7 @@
                 <w:szCs w:val="20"/>
                 <w:rtl w:val="0"/>
               </w:rPr>
-              <w:t xml:space="preserve">Se construirá, entrenará y ajusta el modelo con unas métricas igual o superiores al 80%</w:t>
+              <w:t xml:space="preserve">Construir, entrenar y ajustar el modelo con unas métricas igual o superiores al 80%</w:t>
             </w:r>
           </w:p>
           <w:p>
@@ -2756,7 +2756,7 @@
                 <w:szCs w:val="20"/>
                 <w:rtl w:val="0"/>
               </w:rPr>
-              <w:t xml:space="preserve">Se validará el modelo y el entorno operacional garantizando que el sistema genera las alertas tempranas con un 80% de precisión sobre los eventos registrados </w:t>
+              <w:t xml:space="preserve">Validar el modelo y el entorno operacional garantizando que el sistema genera las alertas tempranas con un 80% de precisión sobre los eventos registrados </w:t>
             </w:r>
           </w:p>
         </w:tc>

</xml_diff>